<commit_message>
Add manuscript sources and R analysis updates
Add many bibliography PDFs under Manuscript/Sources/sources, add compressed manuscript DOCX and update Online_appendix_FINAL.docx and Citation manager.xlsx. Move The_Brexit_Tuition_Shock_v5.docx into Manuscript/For reference; rename several source PDFs. Remove generated manuscript outputs and download_manifest.txt. Update Statistical_documentation_in_R main_results (.RData and .Rhistory) — large R analysis and data-loading code appended (panel construction, regression weights, saturated DiD and event-study models, plotting, and elasticity decomposition).
</commit_message>
<xml_diff>
--- a/Manuscript/Online_appendix_FINAL.docx
+++ b/Manuscript/Online_appendix_FINAL.docx
@@ -10,6 +10,8 @@
           <w:rFonts w:asciiTheme="minorHAnsi" w:hAnsiTheme="minorHAnsi" w:cstheme="minorHAnsi"/>
         </w:rPr>
       </w:pPr>
+      <w:bookmarkStart w:id="0" w:name="_GoBack"/>
+      <w:bookmarkEnd w:id="0"/>
       <w:r>
         <w:rPr>
           <w:b/>
@@ -1402,37 +1404,9 @@
         <w:rPr>
           <w:rFonts w:asciiTheme="minorHAnsi" w:hAnsiTheme="minorHAnsi" w:cstheme="minorHAnsi"/>
         </w:rPr>
-        <w:t xml:space="preserve">The </w:t>
+        <w:t>The standardisation removes level differences arising from market size and yields a scale- and location-invariant representation of each path. This method is consistent with standard practice in time-series similarity analysis (Montero-Manso &amp; Hyndman, 2021)</w:t>
       </w:r>
-      <w:proofErr w:type="spellStart"/>
-      <w:r>
-        <w:rPr>
-          <w:rFonts w:asciiTheme="minorHAnsi" w:hAnsiTheme="minorHAnsi" w:cstheme="minorHAnsi"/>
-        </w:rPr>
-        <w:t>standardisation</w:t>
-      </w:r>
-      <w:proofErr w:type="spellEnd"/>
-      <w:r>
-        <w:rPr>
-          <w:rFonts w:asciiTheme="minorHAnsi" w:hAnsiTheme="minorHAnsi" w:cstheme="minorHAnsi"/>
-        </w:rPr>
-        <w:t xml:space="preserve"> removes level differences arising from market size and yields a scale- and location-invariant representation of each path. This method is consistent with standard practice in time-series similarity analysis (Montero-</w:t>
-      </w:r>
-      <w:proofErr w:type="spellStart"/>
-      <w:r>
-        <w:rPr>
-          <w:rFonts w:asciiTheme="minorHAnsi" w:hAnsiTheme="minorHAnsi" w:cstheme="minorHAnsi"/>
-        </w:rPr>
-        <w:t>Manso</w:t>
-      </w:r>
-      <w:proofErr w:type="spellEnd"/>
-      <w:r>
-        <w:rPr>
-          <w:rFonts w:asciiTheme="minorHAnsi" w:hAnsiTheme="minorHAnsi" w:cstheme="minorHAnsi"/>
-        </w:rPr>
-        <w:t xml:space="preserve"> &amp; Hyndman, 2021)</w:t>
-      </w:r>
-      <w:bookmarkStart w:id="0" w:name="donor-screening"/>
+      <w:bookmarkStart w:id="1" w:name="donor-screening"/>
       <w:r>
         <w:rPr>
           <w:rFonts w:asciiTheme="minorHAnsi" w:hAnsiTheme="minorHAnsi" w:cstheme="minorHAnsi"/>
@@ -1926,8 +1900,8 @@
           <w:rFonts w:asciiTheme="minorHAnsi" w:hAnsiTheme="minorHAnsi" w:cstheme="minorHAnsi"/>
         </w:rPr>
       </w:pPr>
-      <w:bookmarkStart w:id="1" w:name="synthetic-control-weights"/>
-      <w:bookmarkEnd w:id="0"/>
+      <w:bookmarkStart w:id="2" w:name="synthetic-control-weights"/>
+      <w:bookmarkEnd w:id="1"/>
       <w:r>
         <w:rPr>
           <w:rFonts w:asciiTheme="minorHAnsi" w:hAnsiTheme="minorHAnsi" w:cstheme="minorHAnsi"/>
@@ -2784,21 +2758,7 @@
         <w:rPr>
           <w:rFonts w:asciiTheme="minorHAnsi" w:hAnsiTheme="minorHAnsi" w:cstheme="minorHAnsi"/>
         </w:rPr>
-        <w:t xml:space="preserve"> is the unit </w:t>
-      </w:r>
-      <w:proofErr w:type="gramStart"/>
-      <w:r>
-        <w:rPr>
-          <w:rFonts w:asciiTheme="minorHAnsi" w:hAnsiTheme="minorHAnsi" w:cstheme="minorHAnsi"/>
-        </w:rPr>
-        <w:t>simplex.</w:t>
-      </w:r>
-      <w:proofErr w:type="gramEnd"/>
-      <w:r>
-        <w:rPr>
-          <w:rFonts w:asciiTheme="minorHAnsi" w:hAnsiTheme="minorHAnsi" w:cstheme="minorHAnsi"/>
-        </w:rPr>
-        <w:t xml:space="preserve"> The structure of the solution follows from the first-order optimality conditions, which can be written using the Lagrangian,</w:t>
+        <w:t xml:space="preserve"> is the unit simplex. The structure of the solution follows from the first-order optimality conditions, which can be written using the Lagrangian,</w:t>
       </w:r>
     </w:p>
     <w:p>
@@ -4175,7 +4135,7 @@
         <w:t>The fitted pre-treatment path and its associated fit diagnostic are</w:t>
       </w:r>
     </w:p>
-    <w:bookmarkEnd w:id="1"/>
+    <w:bookmarkEnd w:id="2"/>
     <w:p>
       <w:pPr>
         <w:pStyle w:val="FirstParagraph"/>
@@ -5499,21 +5459,7 @@
         <w:rPr>
           <w:rFonts w:asciiTheme="minorHAnsi" w:hAnsiTheme="minorHAnsi" w:cstheme="minorHAnsi"/>
         </w:rPr>
-        <w:t xml:space="preserve">or, equivalently, </w:t>
-      </w:r>
-      <w:proofErr w:type="spellStart"/>
-      <w:r>
-        <w:rPr>
-          <w:rFonts w:asciiTheme="minorHAnsi" w:hAnsiTheme="minorHAnsi" w:cstheme="minorHAnsi"/>
-        </w:rPr>
-        <w:t>componentwise</w:t>
-      </w:r>
-      <w:proofErr w:type="spellEnd"/>
-      <w:r>
-        <w:rPr>
-          <w:rFonts w:asciiTheme="minorHAnsi" w:hAnsiTheme="minorHAnsi" w:cstheme="minorHAnsi"/>
-        </w:rPr>
-        <w:t>,</w:t>
+        <w:t>or, equivalently, componentwise,</w:t>
       </w:r>
     </w:p>
     <w:p>
@@ -5755,21 +5701,7 @@
         <w:rPr>
           <w:rFonts w:asciiTheme="minorHAnsi" w:hAnsiTheme="minorHAnsi" w:cstheme="minorHAnsi"/>
         </w:rPr>
-        <w:t xml:space="preserve">The </w:t>
-      </w:r>
-      <w:proofErr w:type="spellStart"/>
-      <w:r>
-        <w:rPr>
-          <w:rFonts w:asciiTheme="minorHAnsi" w:hAnsiTheme="minorHAnsi" w:cstheme="minorHAnsi"/>
-        </w:rPr>
-        <w:t>normalised</w:t>
-      </w:r>
-      <w:proofErr w:type="spellEnd"/>
-      <w:r>
-        <w:rPr>
-          <w:rFonts w:asciiTheme="minorHAnsi" w:hAnsiTheme="minorHAnsi" w:cstheme="minorHAnsi"/>
-        </w:rPr>
-        <w:t xml:space="preserve"> global weights are</w:t>
+        <w:t>The normalised global weights are</w:t>
       </w:r>
     </w:p>
     <w:p>
@@ -6013,21 +5945,7 @@
         <w:rPr>
           <w:rFonts w:asciiTheme="minorHAnsi" w:hAnsiTheme="minorHAnsi" w:cstheme="minorHAnsi"/>
         </w:rPr>
-        <w:t xml:space="preserve">The </w:t>
-      </w:r>
-      <w:proofErr w:type="spellStart"/>
-      <w:r>
-        <w:rPr>
-          <w:rFonts w:asciiTheme="minorHAnsi" w:hAnsiTheme="minorHAnsi" w:cstheme="minorHAnsi"/>
-        </w:rPr>
-        <w:t>normalisation</w:t>
-      </w:r>
-      <w:proofErr w:type="spellEnd"/>
-      <w:r>
-        <w:rPr>
-          <w:rFonts w:asciiTheme="minorHAnsi" w:hAnsiTheme="minorHAnsi" w:cstheme="minorHAnsi"/>
-        </w:rPr>
-        <w:t xml:space="preserve"> in the expression above is exact</w:t>
+        <w:t>The normalisation in the expression above is exact</w:t>
       </w:r>
       <w:r>
         <w:rPr>
@@ -7356,21 +7274,7 @@
         <w:rPr>
           <w:rFonts w:asciiTheme="minorHAnsi" w:hAnsiTheme="minorHAnsi" w:cstheme="minorHAnsi"/>
         </w:rPr>
-        <w:t xml:space="preserve">The outcome variable is unchanged. The global weights enter the estimation as fixed regression weights, constant over time, with treated observations receiving unit weight. To </w:t>
-      </w:r>
-      <w:proofErr w:type="spellStart"/>
-      <w:r>
-        <w:rPr>
-          <w:rFonts w:asciiTheme="minorHAnsi" w:hAnsiTheme="minorHAnsi" w:cstheme="minorHAnsi"/>
-        </w:rPr>
-        <w:t>equalise</w:t>
-      </w:r>
-      <w:proofErr w:type="spellEnd"/>
-      <w:r>
-        <w:rPr>
-          <w:rFonts w:asciiTheme="minorHAnsi" w:hAnsiTheme="minorHAnsi" w:cstheme="minorHAnsi"/>
-        </w:rPr>
-        <w:t xml:space="preserve"> the total influence of the treated and control sides, the donor weights are scaled by the number of treated countries,</w:t>
+        <w:t>The outcome variable is unchanged. The global weights enter the estimation as fixed regression weights, constant over time, with treated observations receiving unit weight. To equalise the total influence of the treated and control sides, the donor weights are scaled by the number of treated countries,</w:t>
       </w:r>
     </w:p>
     <w:p>
@@ -7997,34 +7901,12 @@
           <w:rFonts w:asciiTheme="minorHAnsi" w:hAnsiTheme="minorHAnsi" w:cstheme="minorHAnsi"/>
         </w:rPr>
       </w:pPr>
-      <w:proofErr w:type="gramStart"/>
       <w:r>
         <w:rPr>
           <w:rFonts w:asciiTheme="minorHAnsi" w:hAnsiTheme="minorHAnsi" w:cstheme="minorHAnsi"/>
         </w:rPr>
         <w:lastRenderedPageBreak/>
-        <w:t>so</w:t>
-      </w:r>
-      <w:proofErr w:type="gramEnd"/>
-      <w:r>
-        <w:rPr>
-          <w:rFonts w:asciiTheme="minorHAnsi" w:hAnsiTheme="minorHAnsi" w:cstheme="minorHAnsi"/>
-        </w:rPr>
-        <w:t xml:space="preserve"> the control group carries the same aggregate weight as the treated group regardless of the number of donors. This </w:t>
-      </w:r>
-      <w:proofErr w:type="spellStart"/>
-      <w:r>
-        <w:rPr>
-          <w:rFonts w:asciiTheme="minorHAnsi" w:hAnsiTheme="minorHAnsi" w:cstheme="minorHAnsi"/>
-        </w:rPr>
-        <w:t>equalises</w:t>
-      </w:r>
-      <w:proofErr w:type="spellEnd"/>
-      <w:r>
-        <w:rPr>
-          <w:rFonts w:asciiTheme="minorHAnsi" w:hAnsiTheme="minorHAnsi" w:cstheme="minorHAnsi"/>
-        </w:rPr>
-        <w:t xml:space="preserve"> the aggregate weight assigned to treated and donor observations in the saturated specification</w:t>
+        <w:t>so the control group carries the same aggregate weight as the treated group regardless of the number of donors. This equalises the aggregate weight assigned to treated and donor observations in the saturated specification</w:t>
       </w:r>
     </w:p>
     <w:p>
@@ -9063,21 +8945,7 @@
         <w:rPr>
           <w:rFonts w:asciiTheme="minorHAnsi" w:hAnsiTheme="minorHAnsi" w:cstheme="minorHAnsi"/>
         </w:rPr>
-        <w:t xml:space="preserve">II. From the Bresnahan conduct model to the </w:t>
-      </w:r>
-      <w:proofErr w:type="spellStart"/>
-      <w:r>
-        <w:rPr>
-          <w:rFonts w:asciiTheme="minorHAnsi" w:hAnsiTheme="minorHAnsi" w:cstheme="minorHAnsi"/>
-        </w:rPr>
-        <w:t>DiD</w:t>
-      </w:r>
-      <w:proofErr w:type="spellEnd"/>
-      <w:r>
-        <w:rPr>
-          <w:rFonts w:asciiTheme="minorHAnsi" w:hAnsiTheme="minorHAnsi" w:cstheme="minorHAnsi"/>
-        </w:rPr>
-        <w:t xml:space="preserve"> specification</w:t>
+        <w:t>II. From the Bresnahan conduct model to the DiD specification</w:t>
       </w:r>
     </w:p>
     <w:p>
@@ -9091,35 +8959,7 @@
         <w:rPr>
           <w:rFonts w:asciiTheme="minorHAnsi" w:hAnsiTheme="minorHAnsi" w:cstheme="minorHAnsi"/>
         </w:rPr>
-        <w:t>Clifton-</w:t>
-      </w:r>
-      <w:proofErr w:type="spellStart"/>
-      <w:r>
-        <w:rPr>
-          <w:rFonts w:asciiTheme="minorHAnsi" w:hAnsiTheme="minorHAnsi" w:cstheme="minorHAnsi"/>
-        </w:rPr>
-        <w:t>Sprigg</w:t>
-      </w:r>
-      <w:proofErr w:type="spellEnd"/>
-      <w:r>
-        <w:rPr>
-          <w:rFonts w:asciiTheme="minorHAnsi" w:hAnsiTheme="minorHAnsi" w:cstheme="minorHAnsi"/>
-        </w:rPr>
-        <w:t xml:space="preserve"> et al. (2025) use the ATE in synthetic </w:t>
-      </w:r>
-      <w:proofErr w:type="spellStart"/>
-      <w:r>
-        <w:rPr>
-          <w:rFonts w:asciiTheme="minorHAnsi" w:hAnsiTheme="minorHAnsi" w:cstheme="minorHAnsi"/>
-        </w:rPr>
-        <w:t>DiD</w:t>
-      </w:r>
-      <w:proofErr w:type="spellEnd"/>
-      <w:r>
-        <w:rPr>
-          <w:rFonts w:asciiTheme="minorHAnsi" w:hAnsiTheme="minorHAnsi" w:cstheme="minorHAnsi"/>
-        </w:rPr>
-        <w:t xml:space="preserve"> to estimate the average collapse in applications for higher education in the UK and derive a mechanical elasticity from that estimate. Their approach, however, lacks a robust theoretical foundation for the elasticity coefficients. In particular, no functional form or structural assumption is invoked to ensure that the implied elasticity is interpretable as a true demand-side parameter. Their design also abstracts from the heterogeneity in demand elasticity across affected EU countries, a limitation we address directly.</w:t>
+        <w:t>Clifton-Sprigg et al. (2025) use the ATE in synthetic DiD to estimate the average collapse in applications for higher education in the UK and derive a mechanical elasticity from that estimate. Their approach, however, lacks a robust theoretical foundation for the elasticity coefficients. In particular, no functional form or structural assumption is invoked to ensure that the implied elasticity is interpretable as a true demand-side parameter. Their design also abstracts from the heterogeneity in demand elasticity across affected EU countries, a limitation we address directly.</w:t>
       </w:r>
     </w:p>
     <w:p>
@@ -9134,35 +8974,7 @@
         <w:rPr>
           <w:rFonts w:asciiTheme="minorHAnsi" w:hAnsiTheme="minorHAnsi" w:cstheme="minorHAnsi"/>
         </w:rPr>
-        <w:t xml:space="preserve">To derive demand elasticities theoretically from a </w:t>
-      </w:r>
-      <w:proofErr w:type="spellStart"/>
-      <w:r>
-        <w:rPr>
-          <w:rFonts w:asciiTheme="minorHAnsi" w:hAnsiTheme="minorHAnsi" w:cstheme="minorHAnsi"/>
-        </w:rPr>
-        <w:t>DiD</w:t>
-      </w:r>
-      <w:proofErr w:type="spellEnd"/>
-      <w:r>
-        <w:rPr>
-          <w:rFonts w:asciiTheme="minorHAnsi" w:hAnsiTheme="minorHAnsi" w:cstheme="minorHAnsi"/>
-        </w:rPr>
-        <w:t xml:space="preserve"> (or </w:t>
-      </w:r>
-      <w:proofErr w:type="spellStart"/>
-      <w:r>
-        <w:rPr>
-          <w:rFonts w:asciiTheme="minorHAnsi" w:hAnsiTheme="minorHAnsi" w:cstheme="minorHAnsi"/>
-        </w:rPr>
-        <w:t>DiD</w:t>
-      </w:r>
-      <w:proofErr w:type="spellEnd"/>
-      <w:r>
-        <w:rPr>
-          <w:rFonts w:asciiTheme="minorHAnsi" w:hAnsiTheme="minorHAnsi" w:cstheme="minorHAnsi"/>
-        </w:rPr>
-        <w:t xml:space="preserve">-adjacent) design, consider a segmented demand system indexed by origin country </w:t>
+        <w:t xml:space="preserve">To derive demand elasticities theoretically from a DiD (or DiD-adjacent) design, consider a segmented demand system indexed by origin country </w:t>
       </w:r>
       <m:oMath>
         <m:r>
@@ -9788,8 +9600,6 @@
           </m:sub>
         </m:sSub>
       </m:oMath>
-      <w:bookmarkStart w:id="2" w:name="_GoBack"/>
-      <w:bookmarkEnd w:id="2"/>
       <w:r>
         <w:rPr>
           <w:rFonts w:asciiTheme="minorHAnsi" w:hAnsiTheme="minorHAnsi" w:cstheme="minorHAnsi"/>
@@ -9854,16 +9664,8 @@
         <w:rPr>
           <w:rFonts w:asciiTheme="minorHAnsi" w:hAnsiTheme="minorHAnsi" w:cstheme="minorHAnsi"/>
         </w:rPr>
-        <w:t xml:space="preserve"> is an error term assumed to be normally distributed with mean </w:t>
+        <w:t xml:space="preserve"> is an error term assumed to be normally distributed with mean zero.</w:t>
       </w:r>
-      <w:proofErr w:type="gramStart"/>
-      <w:r>
-        <w:rPr>
-          <w:rFonts w:asciiTheme="minorHAnsi" w:hAnsiTheme="minorHAnsi" w:cstheme="minorHAnsi"/>
-        </w:rPr>
-        <w:t>zero.</w:t>
-      </w:r>
-      <w:proofErr w:type="gramEnd"/>
     </w:p>
     <w:p>
       <w:pPr>
@@ -10482,16 +10284,8 @@
         <w:rPr>
           <w:rFonts w:asciiTheme="minorHAnsi" w:hAnsiTheme="minorHAnsi" w:cstheme="minorHAnsi"/>
         </w:rPr>
-        <w:t xml:space="preserve"> is a pricing error term assumed to be normally distributed with mean </w:t>
+        <w:t xml:space="preserve"> is a pricing error term assumed to be normally distributed with mean zero.</w:t>
       </w:r>
-      <w:proofErr w:type="gramStart"/>
-      <w:r>
-        <w:rPr>
-          <w:rFonts w:asciiTheme="minorHAnsi" w:hAnsiTheme="minorHAnsi" w:cstheme="minorHAnsi"/>
-        </w:rPr>
-        <w:t>zero.</w:t>
-      </w:r>
-      <w:proofErr w:type="gramEnd"/>
     </w:p>
     <w:p>
       <w:pPr>
@@ -11613,21 +11407,7 @@
         <w:rPr>
           <w:rFonts w:asciiTheme="minorHAnsi" w:hAnsiTheme="minorHAnsi" w:cstheme="minorHAnsi"/>
         </w:rPr>
-        <w:t xml:space="preserve"> are time-invariant and are absorbed by the demeaning step in any standard TWFE specification. The composite error is inherently heteroskedastic and serially correlated, so we estimate the models using Driscoll and </w:t>
-      </w:r>
-      <w:proofErr w:type="spellStart"/>
-      <w:r>
-        <w:rPr>
-          <w:rFonts w:asciiTheme="minorHAnsi" w:hAnsiTheme="minorHAnsi" w:cstheme="minorHAnsi"/>
-        </w:rPr>
-        <w:t>Kraay</w:t>
-      </w:r>
-      <w:proofErr w:type="spellEnd"/>
-      <w:r>
-        <w:rPr>
-          <w:rFonts w:asciiTheme="minorHAnsi" w:hAnsiTheme="minorHAnsi" w:cstheme="minorHAnsi"/>
-        </w:rPr>
-        <w:t xml:space="preserve"> (1998) standard errors to account for cross-sectional dependence and serial correlation. The derivations imply the reduced-form specification:</w:t>
+        <w:t xml:space="preserve"> are time-invariant and are absorbed by the demeaning step in any standard TWFE specification. The composite error is inherently heteroskedastic and serially correlated, so we estimate the models using Driscoll and Kraay (1998) standard errors to account for cross-sectional dependence and serial correlation. The derivations imply the reduced-form specification:</w:t>
       </w:r>
     </w:p>
     <w:p>
@@ -12237,42 +12017,14 @@
         <w:rPr>
           <w:rFonts w:asciiTheme="minorHAnsi" w:hAnsiTheme="minorHAnsi" w:cstheme="minorHAnsi"/>
         </w:rPr>
-        <w:t xml:space="preserve">. When we collapse to a single treatment indicator for all EU countries (an indicator equal to 1 for any country in the EU), the two-way fixed-effects (TWFE) </w:t>
-      </w:r>
-      <w:proofErr w:type="spellStart"/>
-      <w:r>
-        <w:rPr>
-          <w:rFonts w:asciiTheme="minorHAnsi" w:hAnsiTheme="minorHAnsi" w:cstheme="minorHAnsi"/>
-        </w:rPr>
-        <w:t>DiD</w:t>
-      </w:r>
-      <w:proofErr w:type="spellEnd"/>
-      <w:r>
-        <w:rPr>
-          <w:rFonts w:asciiTheme="minorHAnsi" w:hAnsiTheme="minorHAnsi" w:cstheme="minorHAnsi"/>
-        </w:rPr>
-        <w:t xml:space="preserve"> regression identifies the average treatment effect on the treated in log units. Although we report robustness checks under alternative estimators, the most credible way to retain the </w:t>
+        <w:t xml:space="preserve">. When we collapse to a single treatment indicator for all EU countries (an indicator equal to 1 for any country in the EU), the two-way fixed-effects (TWFE) DiD regression identifies the average treatment effect on the treated in log units. Although we report robustness checks under alternative estimators, the most credible way to retain the </w:t>
       </w:r>
       <w:r>
         <w:rPr>
           <w:rFonts w:asciiTheme="minorHAnsi" w:hAnsiTheme="minorHAnsi" w:cstheme="minorHAnsi"/>
         </w:rPr>
         <w:lastRenderedPageBreak/>
-        <w:t xml:space="preserve">saturated form of the </w:t>
-      </w:r>
-      <w:proofErr w:type="spellStart"/>
-      <w:r>
-        <w:rPr>
-          <w:rFonts w:asciiTheme="minorHAnsi" w:hAnsiTheme="minorHAnsi" w:cstheme="minorHAnsi"/>
-        </w:rPr>
-        <w:t>DiD</w:t>
-      </w:r>
-      <w:proofErr w:type="spellEnd"/>
-      <w:r>
-        <w:rPr>
-          <w:rFonts w:asciiTheme="minorHAnsi" w:hAnsiTheme="minorHAnsi" w:cstheme="minorHAnsi"/>
-        </w:rPr>
-        <w:t xml:space="preserve"> regression is via the TWFE estimator. After simple algebraic manipulation of equation (2), and imposing </w:t>
+        <w:t xml:space="preserve">saturated form of the DiD regression is via the TWFE estimator. After simple algebraic manipulation of equation (2), and imposing </w:t>
       </w:r>
       <m:oMath>
         <m:d>
@@ -19460,7 +19212,6 @@
                 <w:szCs w:val="20"/>
               </w:rPr>
             </w:pPr>
-            <w:proofErr w:type="gramStart"/>
             <w:r>
               <w:rPr>
                 <w:rFonts w:eastAsia="Times New Roman"/>
@@ -19469,18 +19220,7 @@
                 <w:sz w:val="20"/>
                 <w:szCs w:val="20"/>
               </w:rPr>
-              <w:t>log(</w:t>
-            </w:r>
-            <w:proofErr w:type="gramEnd"/>
-            <w:r>
-              <w:rPr>
-                <w:rFonts w:eastAsia="Times New Roman"/>
-                <w:b/>
-                <w:bCs/>
-                <w:sz w:val="20"/>
-                <w:szCs w:val="20"/>
-              </w:rPr>
-              <w:t>Applicants)</w:t>
+              <w:t>log(Applicants)</w:t>
             </w:r>
           </w:p>
         </w:tc>
@@ -30817,25 +30557,7 @@
                 <w:sz w:val="20"/>
                 <w:szCs w:val="20"/>
               </w:rPr>
-              <w:t>Driscoll-</w:t>
-            </w:r>
-            <w:proofErr w:type="spellStart"/>
-            <w:r>
-              <w:rPr>
-                <w:rFonts w:eastAsia="Times New Roman"/>
-                <w:sz w:val="20"/>
-                <w:szCs w:val="20"/>
-              </w:rPr>
-              <w:t>Kraay</w:t>
-            </w:r>
-            <w:proofErr w:type="spellEnd"/>
-            <w:r>
-              <w:rPr>
-                <w:rFonts w:eastAsia="Times New Roman"/>
-                <w:sz w:val="20"/>
-                <w:szCs w:val="20"/>
-              </w:rPr>
-              <w:t xml:space="preserve"> (L=1)</w:t>
+              <w:t>Driscoll-Kraay (L=1)</w:t>
             </w:r>
           </w:p>
         </w:tc>
@@ -31305,25 +31027,7 @@
                 <w:sz w:val="20"/>
                 <w:szCs w:val="20"/>
               </w:rPr>
-              <w:t>Driscoll-</w:t>
-            </w:r>
-            <w:proofErr w:type="spellStart"/>
-            <w:r>
-              <w:rPr>
-                <w:rFonts w:eastAsia="Times New Roman"/>
-                <w:sz w:val="20"/>
-                <w:szCs w:val="20"/>
-              </w:rPr>
-              <w:t>Kraay</w:t>
-            </w:r>
-            <w:proofErr w:type="spellEnd"/>
-            <w:r>
-              <w:rPr>
-                <w:rFonts w:eastAsia="Times New Roman"/>
-                <w:sz w:val="20"/>
-                <w:szCs w:val="20"/>
-              </w:rPr>
-              <w:t xml:space="preserve"> standard errors in parentheses. Significance codes follow the original output.  </w:t>
+              <w:t>Driscoll-Kraay standard errors in parentheses. Significance codes follow the original output.  </w:t>
             </w:r>
           </w:p>
         </w:tc>
@@ -36321,21 +36025,7 @@
         <w:rPr>
           <w:rFonts w:asciiTheme="minorHAnsi" w:hAnsiTheme="minorHAnsi" w:cstheme="minorHAnsi"/>
         </w:rPr>
-        <w:t>Heteroskedasticity- and autocorrelation-consistent (Driscoll–</w:t>
-      </w:r>
-      <w:proofErr w:type="spellStart"/>
-      <w:r>
-        <w:rPr>
-          <w:rFonts w:asciiTheme="minorHAnsi" w:hAnsiTheme="minorHAnsi" w:cstheme="minorHAnsi"/>
-        </w:rPr>
-        <w:t>Kraay</w:t>
-      </w:r>
-      <w:proofErr w:type="spellEnd"/>
-      <w:r>
-        <w:rPr>
-          <w:rFonts w:asciiTheme="minorHAnsi" w:hAnsiTheme="minorHAnsi" w:cstheme="minorHAnsi"/>
-        </w:rPr>
-        <w:t>) standard errors in parentheses. + p&lt;0.10, * p&lt;0.05, ** p&lt;0.01, *** p&lt;0.001.</w:t>
+        <w:t>Heteroskedasticity- and autocorrelation-consistent (Driscoll–Kraay) standard errors in parentheses. + p&lt;0.10, * p&lt;0.05, ** p&lt;0.01, *** p&lt;0.001.</w:t>
       </w:r>
     </w:p>
     <w:p>
@@ -36380,21 +36070,7 @@
         <w:rPr>
           <w:rFonts w:asciiTheme="minorHAnsi" w:hAnsiTheme="minorHAnsi" w:cstheme="minorHAnsi"/>
         </w:rPr>
-        <w:t xml:space="preserve">Abadie, A., &amp; </w:t>
-      </w:r>
-      <w:proofErr w:type="spellStart"/>
-      <w:r>
-        <w:rPr>
-          <w:rFonts w:asciiTheme="minorHAnsi" w:hAnsiTheme="minorHAnsi" w:cstheme="minorHAnsi"/>
-        </w:rPr>
-        <w:t>Cattaneo</w:t>
-      </w:r>
-      <w:proofErr w:type="spellEnd"/>
-      <w:r>
-        <w:rPr>
-          <w:rFonts w:asciiTheme="minorHAnsi" w:hAnsiTheme="minorHAnsi" w:cstheme="minorHAnsi"/>
-        </w:rPr>
-        <w:t xml:space="preserve">, M. D. (2018). Econometric methods for program evaluation. Annual Review of Economics, 10, 465–503. </w:t>
+        <w:t xml:space="preserve">Abadie, A., &amp; Cattaneo, M. D. (2018). Econometric methods for program evaluation. Annual Review of Economics, 10, 465–503. </w:t>
       </w:r>
       <w:hyperlink r:id="rId7" w:history="1">
         <w:r>
@@ -36425,21 +36101,7 @@
           <w:rFonts w:asciiTheme="minorHAnsi" w:hAnsiTheme="minorHAnsi" w:cstheme="minorHAnsi"/>
         </w:rPr>
         <w:lastRenderedPageBreak/>
-        <w:t xml:space="preserve">Abadie, A., Diamond, A., &amp; </w:t>
-      </w:r>
-      <w:proofErr w:type="spellStart"/>
-      <w:r>
-        <w:rPr>
-          <w:rFonts w:asciiTheme="minorHAnsi" w:hAnsiTheme="minorHAnsi" w:cstheme="minorHAnsi"/>
-        </w:rPr>
-        <w:t>Hainmueller</w:t>
-      </w:r>
-      <w:proofErr w:type="spellEnd"/>
-      <w:r>
-        <w:rPr>
-          <w:rFonts w:asciiTheme="minorHAnsi" w:hAnsiTheme="minorHAnsi" w:cstheme="minorHAnsi"/>
-        </w:rPr>
-        <w:t xml:space="preserve">, J. (2010). Synthetic control methods for comparative case studies: Estimating the effect of California’s tobacco control program. Journal of the American Statistical Association, 105(490), 493–505. </w:t>
+        <w:t xml:space="preserve">Abadie, A., Diamond, A., &amp; Hainmueller, J. (2010). Synthetic control methods for comparative case studies: Estimating the effect of California’s tobacco control program. Journal of the American Statistical Association, 105(490), 493–505. </w:t>
       </w:r>
       <w:hyperlink w:history="1">
         <w:r>
@@ -36493,49 +36155,7 @@
         <w:rPr>
           <w:rFonts w:asciiTheme="minorHAnsi" w:hAnsiTheme="minorHAnsi" w:cstheme="minorHAnsi"/>
         </w:rPr>
-        <w:t>Clifton-</w:t>
-      </w:r>
-      <w:proofErr w:type="spellStart"/>
-      <w:r>
-        <w:rPr>
-          <w:rFonts w:asciiTheme="minorHAnsi" w:hAnsiTheme="minorHAnsi" w:cstheme="minorHAnsi"/>
-        </w:rPr>
-        <w:t>Sprigg</w:t>
-      </w:r>
-      <w:proofErr w:type="spellEnd"/>
-      <w:r>
-        <w:rPr>
-          <w:rFonts w:asciiTheme="minorHAnsi" w:hAnsiTheme="minorHAnsi" w:cstheme="minorHAnsi"/>
-        </w:rPr>
-        <w:t xml:space="preserve">, J., Homburg, I., </w:t>
-      </w:r>
-      <w:proofErr w:type="spellStart"/>
-      <w:r>
-        <w:rPr>
-          <w:rFonts w:asciiTheme="minorHAnsi" w:hAnsiTheme="minorHAnsi" w:cstheme="minorHAnsi"/>
-        </w:rPr>
-        <w:t>Huyghe</w:t>
-      </w:r>
-      <w:proofErr w:type="spellEnd"/>
-      <w:r>
-        <w:rPr>
-          <w:rFonts w:asciiTheme="minorHAnsi" w:hAnsiTheme="minorHAnsi" w:cstheme="minorHAnsi"/>
-        </w:rPr>
-        <w:t xml:space="preserve">, A., &amp; </w:t>
-      </w:r>
-      <w:proofErr w:type="spellStart"/>
-      <w:r>
-        <w:rPr>
-          <w:rFonts w:asciiTheme="minorHAnsi" w:hAnsiTheme="minorHAnsi" w:cstheme="minorHAnsi"/>
-        </w:rPr>
-        <w:t>Vujić</w:t>
-      </w:r>
-      <w:proofErr w:type="spellEnd"/>
-      <w:r>
-        <w:rPr>
-          <w:rFonts w:asciiTheme="minorHAnsi" w:hAnsiTheme="minorHAnsi" w:cstheme="minorHAnsi"/>
-        </w:rPr>
-        <w:t>, S. (2025). International student migration: Did Brexit close the door to EU students? (IZA Discussion Paper No. 18178). IZA Institute of Labor Economics.</w:t>
+        <w:t>Clifton-Sprigg, J., Homburg, I., Huyghe, A., &amp; Vujić, S. (2025). International student migration: Did Brexit close the door to EU students? (IZA Discussion Paper No. 18178). IZA Institute of Labor Economics.</w:t>
       </w:r>
     </w:p>
     <w:p>
@@ -36550,21 +36170,7 @@
         <w:rPr>
           <w:rFonts w:asciiTheme="minorHAnsi" w:hAnsiTheme="minorHAnsi" w:cstheme="minorHAnsi"/>
         </w:rPr>
-        <w:t xml:space="preserve">Driscoll, J. C., &amp; </w:t>
-      </w:r>
-      <w:proofErr w:type="spellStart"/>
-      <w:r>
-        <w:rPr>
-          <w:rFonts w:asciiTheme="minorHAnsi" w:hAnsiTheme="minorHAnsi" w:cstheme="minorHAnsi"/>
-        </w:rPr>
-        <w:t>Kraay</w:t>
-      </w:r>
-      <w:proofErr w:type="spellEnd"/>
-      <w:r>
-        <w:rPr>
-          <w:rFonts w:asciiTheme="minorHAnsi" w:hAnsiTheme="minorHAnsi" w:cstheme="minorHAnsi"/>
-        </w:rPr>
-        <w:t xml:space="preserve">, A. C. (1998). Consistent covariance matrix estimation with spatially dependent panel data. Review of Economics and Statistics, 80(4), 549–560. </w:t>
+        <w:t xml:space="preserve">Driscoll, J. C., &amp; Kraay, A. C. (1998). Consistent covariance matrix estimation with spatially dependent panel data. Review of Economics and Statistics, 80(4), 549–560. </w:t>
       </w:r>
       <w:hyperlink r:id="rId9" w:history="1">
         <w:r>
@@ -36590,33 +36196,11 @@
           <w:rFonts w:asciiTheme="minorHAnsi" w:hAnsiTheme="minorHAnsi" w:cstheme="minorHAnsi"/>
         </w:rPr>
       </w:pPr>
-      <w:proofErr w:type="spellStart"/>
       <w:r>
         <w:rPr>
           <w:rFonts w:asciiTheme="minorHAnsi" w:hAnsiTheme="minorHAnsi" w:cstheme="minorHAnsi"/>
         </w:rPr>
-        <w:t>Giorgino</w:t>
-      </w:r>
-      <w:proofErr w:type="spellEnd"/>
-      <w:r>
-        <w:rPr>
-          <w:rFonts w:asciiTheme="minorHAnsi" w:hAnsiTheme="minorHAnsi" w:cstheme="minorHAnsi"/>
-        </w:rPr>
-        <w:t xml:space="preserve">, T. (2009). Computing and visualizing dynamic time warping alignments in R: The </w:t>
-      </w:r>
-      <w:proofErr w:type="spellStart"/>
-      <w:r>
-        <w:rPr>
-          <w:rFonts w:asciiTheme="minorHAnsi" w:hAnsiTheme="minorHAnsi" w:cstheme="minorHAnsi"/>
-        </w:rPr>
-        <w:t>dtw</w:t>
-      </w:r>
-      <w:proofErr w:type="spellEnd"/>
-      <w:r>
-        <w:rPr>
-          <w:rFonts w:asciiTheme="minorHAnsi" w:hAnsiTheme="minorHAnsi" w:cstheme="minorHAnsi"/>
-        </w:rPr>
-        <w:t xml:space="preserve"> package. Journal of Statistical Software, 31(7), 1–24. </w:t>
+        <w:t xml:space="preserve">Giorgino, T. (2009). Computing and visualizing dynamic time warping alignments in R: The dtw package. Journal of Statistical Software, 31(7), 1–24. </w:t>
       </w:r>
       <w:hyperlink w:history="1">
         <w:r>
@@ -36670,21 +36254,7 @@
         <w:rPr>
           <w:rFonts w:asciiTheme="minorHAnsi" w:hAnsiTheme="minorHAnsi" w:cstheme="minorHAnsi"/>
         </w:rPr>
-        <w:t>Montero-</w:t>
-      </w:r>
-      <w:proofErr w:type="spellStart"/>
-      <w:r>
-        <w:rPr>
-          <w:rFonts w:asciiTheme="minorHAnsi" w:hAnsiTheme="minorHAnsi" w:cstheme="minorHAnsi"/>
-        </w:rPr>
-        <w:t>Manso</w:t>
-      </w:r>
-      <w:proofErr w:type="spellEnd"/>
-      <w:r>
-        <w:rPr>
-          <w:rFonts w:asciiTheme="minorHAnsi" w:hAnsiTheme="minorHAnsi" w:cstheme="minorHAnsi"/>
-        </w:rPr>
-        <w:t xml:space="preserve">, P., &amp; Hyndman, R. J. (2021). Principles and algorithms for forecasting groups of time series: Locality and globality. International Journal of Forecasting, 37(4), 1632–1653. </w:t>
+        <w:t xml:space="preserve">Montero-Manso, P., &amp; Hyndman, R. J. (2021). Principles and algorithms for forecasting groups of time series: Locality and globality. International Journal of Forecasting, 37(4), 1632–1653. </w:t>
       </w:r>
       <w:hyperlink r:id="rId11" w:history="1">
         <w:r>
@@ -36740,19 +36310,11 @@
           <w:rFonts w:asciiTheme="minorHAnsi" w:hAnsiTheme="minorHAnsi" w:cstheme="minorHAnsi"/>
         </w:rPr>
       </w:pPr>
-      <w:proofErr w:type="spellStart"/>
       <w:r>
         <w:rPr>
           <w:rFonts w:asciiTheme="minorHAnsi" w:hAnsiTheme="minorHAnsi" w:cstheme="minorHAnsi"/>
         </w:rPr>
-        <w:t>Sakoe</w:t>
-      </w:r>
-      <w:proofErr w:type="spellEnd"/>
-      <w:r>
-        <w:rPr>
-          <w:rFonts w:asciiTheme="minorHAnsi" w:hAnsiTheme="minorHAnsi" w:cstheme="minorHAnsi"/>
-        </w:rPr>
-        <w:t xml:space="preserve">, H., &amp; Chiba, S. (1978). Dynamic programming algorithm optimization for spoken word recognition. IEEE Transactions on Acoustics, Speech, and Signal Processing, 26(1), 43–49. </w:t>
+        <w:t xml:space="preserve">Sakoe, H., &amp; Chiba, S. (1978). Dynamic programming algorithm optimization for spoken word recognition. IEEE Transactions on Acoustics, Speech, and Signal Processing, 26(1), 43–49. </w:t>
       </w:r>
       <w:hyperlink w:history="1">
         <w:r>
@@ -38194,7 +37756,7 @@
 </file>
 
 <file path=customXml/itemProps1.xml><?xml version="1.0" encoding="utf-8"?>
-<ds:datastoreItem xmlns:ds="http://schemas.openxmlformats.org/officeDocument/2006/customXml" ds:itemID="{1A30CEA3-E12D-4619-BB4B-B6EF0C10A5D9}">
+<ds:datastoreItem xmlns:ds="http://schemas.openxmlformats.org/officeDocument/2006/customXml" ds:itemID="{8DFCF054-C8F7-4BCA-9911-D72977942D16}">
   <ds:schemaRefs>
     <ds:schemaRef ds:uri="http://schemas.openxmlformats.org/officeDocument/2006/bibliography"/>
   </ds:schemaRefs>

</xml_diff>